<commit_message>
docs: update abstract and proper labels for shade
</commit_message>
<xml_diff>
--- a/Abstract_mrt_shade_2025_May_to_Sept_3_PASS_neighborhoods.docx
+++ b/Abstract_mrt_shade_2025_May_to_Sept_3_PASS_neighborhoods.docx
@@ -22,7 +22,31 @@
         <w:jc w:val="both"/>
       </w:pPr>
       <w:r>
-        <w:t>This dataset is a collection of 1-m resolution Mean Radiant Temperature (Tmrt) and shade raster files generated using digital surface models and the Solar and LongWave Environmental Irradiance Geometry (SOLWEIG) model. The dataset provides hourly Tmrt and shade estimates from 07:00 to 20:00 Mountain Standard Time for three Phoenix Area Social Survey (</w:t>
+        <w:t>This dataset is a collection of 1-m resolution Mean Radiant Temperature (</w:t>
+      </w:r>
+      <w:proofErr w:type="spellStart"/>
+      <w:r>
+        <w:t>Tmrt</w:t>
+      </w:r>
+      <w:proofErr w:type="spellEnd"/>
+      <w:r>
+        <w:t xml:space="preserve">) and shade raster files generated using digital surface models and the Solar and </w:t>
+      </w:r>
+      <w:proofErr w:type="spellStart"/>
+      <w:r>
+        <w:t>LongWave</w:t>
+      </w:r>
+      <w:proofErr w:type="spellEnd"/>
+      <w:r>
+        <w:t xml:space="preserve"> Environmental Irradiance Geometry (SOLWEIG) model. The dataset provides hourly </w:t>
+      </w:r>
+      <w:proofErr w:type="spellStart"/>
+      <w:r>
+        <w:t>Tmrt</w:t>
+      </w:r>
+      <w:proofErr w:type="spellEnd"/>
+      <w:r>
+        <w:t xml:space="preserve"> and shade estimates from 07:00 to 20:00 Mountain Standard Time for three Phoenix Area Social Survey (</w:t>
       </w:r>
       <w:r>
         <w:rPr>
@@ -128,16 +152,31 @@
         <w:jc w:val="both"/>
       </w:pPr>
       <w:r>
-        <w:t>For each selected day and hour, the dataset includes both Tmrt and shade raster files, with the shade raster</w:t>
-      </w:r>
-      <w:r>
-        <w:t xml:space="preserve"> file</w:t>
-      </w:r>
-      <w:r>
-        <w:t>s representing shade from buildings and vegetation. Because the PASS neighborhood boundaries are irregular, each neighborhood area was enclosed within a bounding box. These boxes were further expanded using a 5 km buffer to enable analysis of different route types originating within the neighborhoods and extending to destinations outside them. The raster data cover these buffered regions</w:t>
-      </w:r>
-      <w:r>
-        <w:t>. Neighborhood boundary maps are provided with this dataset so that they can be used to extract MRT or shade data for just the neighborhoods.</w:t>
+        <w:t>For each selected day and hour, the dataset includes both mean radiant temperature (</w:t>
+      </w:r>
+      <w:proofErr w:type="spellStart"/>
+      <w:r>
+        <w:t>Tmrt</w:t>
+      </w:r>
+      <w:proofErr w:type="spellEnd"/>
+      <w:r>
+        <w:t xml:space="preserve">) and shade raster files. The shade </w:t>
+      </w:r>
+      <w:proofErr w:type="spellStart"/>
+      <w:r>
+        <w:t>rasters</w:t>
+      </w:r>
+      <w:proofErr w:type="spellEnd"/>
+      <w:r>
+        <w:t xml:space="preserve"> represent shade from buildings and vegetation. Because the PASS neighborhood boundaries are irregularly shaped, each neighborhood was first enclosed within a rectangular bounding box. Each bounding box was then expanded outward by 5 km in all directions to create a buffered study area. These buffered areas were used to support analysis of route types that originate within the neighborhoods and extend to destinations outside them. The raster data cover the full buffered study areas. Neighborhood boundary maps are also provided with the dataset so that users can extract </w:t>
+      </w:r>
+      <w:proofErr w:type="spellStart"/>
+      <w:r>
+        <w:t>Tmrt</w:t>
+      </w:r>
+      <w:proofErr w:type="spellEnd"/>
+      <w:r>
+        <w:t xml:space="preserve"> or shade data specifically within the original neighborhood boundaries.</w:t>
       </w:r>
     </w:p>
     <w:p>
@@ -145,7 +184,23 @@
         <w:jc w:val="both"/>
       </w:pPr>
       <w:r>
-        <w:t>This dataset extends prior 1-m Tmrt raster products for Maricopa County by adding multi-day seasonal coverage and paired shade information at the neighborhood scale. It can support studies of pedestrian heat exposure, neighborhood-scale heat vulnerability, tree and building shade benefits, and the design and evaluation of urban heat mitigation strategies.</w:t>
+        <w:t xml:space="preserve">This dataset extends prior 1-m </w:t>
+      </w:r>
+      <w:proofErr w:type="spellStart"/>
+      <w:r>
+        <w:t>Tmrt</w:t>
+      </w:r>
+      <w:proofErr w:type="spellEnd"/>
+      <w:r>
+        <w:t xml:space="preserve"> raster products for Maricopa County by adding multi-day seasonal coverage and paired </w:t>
+      </w:r>
+      <w:proofErr w:type="spellStart"/>
+      <w:r>
+        <w:t>shade</w:t>
+      </w:r>
+      <w:proofErr w:type="spellEnd"/>
+      <w:r>
+        <w:t xml:space="preserve"> information at the neighborhood scale. It can support studies of pedestrian heat exposure, neighborhood-scale heat vulnerability, tree and building shade benefits, and the design and evaluation of urban heat mitigation strategies.</w:t>
       </w:r>
       <w:r>
         <w:t xml:space="preserve"> </w:t>
@@ -230,7 +285,15 @@
     </w:p>
     <w:p>
       <w:r>
-        <w:t>We used the SOLWEIG model to estimate Mean Radiant Temperature (MRT). SOLWEIG requires three surface models — a Digital Elevation Model (DEM), a Building Surface Model (BSM), and a Canopy Digital Surface Model (CDSM) — along with meteorological forcing data. The surface models were generated from high-resolution LiDAR Point Cloud (LPC) data obtained from the USGS. Meteorological inputs, including air temperature, wind speed, relative humidity, and solar radiation, were sourced from the Phoenix Encanto weather station which is part of the AZMet network.</w:t>
+        <w:t xml:space="preserve">We used the SOLWEIG model to estimate Mean Radiant Temperature (MRT). SOLWEIG requires three surface models — a Digital Elevation Model (DEM), a Building Surface Model (BSM), and a Canopy Digital Surface Model (CDSM) — along with meteorological forcing data. The surface models were generated from high-resolution LiDAR Point Cloud (LPC) data obtained from the USGS. Meteorological inputs, including air temperature, wind speed, relative humidity, and solar radiation, were sourced from the Phoenix Encanto weather station which is part of the </w:t>
+      </w:r>
+      <w:proofErr w:type="spellStart"/>
+      <w:r>
+        <w:t>AZMet</w:t>
+      </w:r>
+      <w:proofErr w:type="spellEnd"/>
+      <w:r>
+        <w:t xml:space="preserve"> network.</w:t>
       </w:r>
     </w:p>
     <w:p>
@@ -240,7 +303,39 @@
     </w:p>
     <w:p>
       <w:r>
-        <w:t>For each selected date and hour, SOLWEIG was used to generate 1-m resolution Tmrt rasters and corresponding shade rasters. The shade rasters represent areas shaded by buildings and vegetation canopy.</w:t>
+        <w:t xml:space="preserve">For each selected date and hour, SOLWEIG was used to generate 1-m resolution </w:t>
+      </w:r>
+      <w:proofErr w:type="spellStart"/>
+      <w:r>
+        <w:t>Tmrt</w:t>
+      </w:r>
+      <w:proofErr w:type="spellEnd"/>
+      <w:r>
+        <w:t xml:space="preserve"> </w:t>
+      </w:r>
+      <w:proofErr w:type="spellStart"/>
+      <w:r>
+        <w:t>rasters</w:t>
+      </w:r>
+      <w:proofErr w:type="spellEnd"/>
+      <w:r>
+        <w:t xml:space="preserve"> and corresponding shade </w:t>
+      </w:r>
+      <w:proofErr w:type="spellStart"/>
+      <w:r>
+        <w:t>rasters</w:t>
+      </w:r>
+      <w:proofErr w:type="spellEnd"/>
+      <w:r>
+        <w:t xml:space="preserve">. The shade </w:t>
+      </w:r>
+      <w:proofErr w:type="spellStart"/>
+      <w:r>
+        <w:t>rasters</w:t>
+      </w:r>
+      <w:proofErr w:type="spellEnd"/>
+      <w:r>
+        <w:t xml:space="preserve"> represent areas shaded by buildings and vegetation canopy.</w:t>
       </w:r>
     </w:p>
     <w:p>

</xml_diff>

<commit_message>
fix: update abstract to reflect proper coding for shade
</commit_message>
<xml_diff>
--- a/Abstract_mrt_shade_2025_May_to_Sept_3_PASS_neighborhoods.docx
+++ b/Abstract_mrt_shade_2025_May_to_Sept_3_PASS_neighborhoods.docx
@@ -46,7 +46,13 @@
       </w:r>
       <w:proofErr w:type="spellEnd"/>
       <w:r>
-        <w:t xml:space="preserve"> and shade estimates from 07:00 to 20:00 Mountain Standard Time for three Phoenix Area Social Survey (</w:t>
+        <w:t xml:space="preserve"> and shade estimates from 07:00 to </w:t>
+      </w:r>
+      <w:r>
+        <w:t>19</w:t>
+      </w:r>
+      <w:r>
+        <w:t>:00 Mountain Standard Time for three Phoenix Area Social Survey (</w:t>
       </w:r>
       <w:r>
         <w:rPr>
@@ -177,6 +183,28 @@
       <w:proofErr w:type="spellEnd"/>
       <w:r>
         <w:t xml:space="preserve"> or shade data specifically within the original neighborhood boundaries.</w:t>
+      </w:r>
+      <w:r>
+        <w:t xml:space="preserve"> </w:t>
+      </w:r>
+      <w:r>
+        <w:t xml:space="preserve">The unit of </w:t>
+      </w:r>
+      <w:proofErr w:type="spellStart"/>
+      <w:r>
+        <w:t>Tmrt</w:t>
+      </w:r>
+      <w:proofErr w:type="spellEnd"/>
+      <w:r>
+        <w:t xml:space="preserve"> is degrees Celsius (°C). The shade </w:t>
+      </w:r>
+      <w:proofErr w:type="spellStart"/>
+      <w:r>
+        <w:t>rasters</w:t>
+      </w:r>
+      <w:proofErr w:type="spellEnd"/>
+      <w:r>
+        <w:t xml:space="preserve"> are binary, with values of 1 indicating no shade and values of 0 indicating shade.</w:t>
       </w:r>
     </w:p>
     <w:p>
@@ -219,6 +247,7 @@
         <w:rPr>
           <w:noProof/>
         </w:rPr>
+        <w:lastRenderedPageBreak/>
         <w:drawing>
           <wp:inline distT="0" distB="0" distL="0" distR="0" wp14:anchorId="433895EF" wp14:editId="7D8D6533">
             <wp:extent cx="4325510" cy="3060206"/>
@@ -340,7 +369,13 @@
     </w:p>
     <w:p>
       <w:r>
-        <w:t>The dataset covers five months from May through September 2025. For each month, three clear-sky days were selected to represent the early, middle, and late portions of the month, resulting in 15 selected days. For each selected day, hourly outputs were generated from 07:00 to 20:00 Mountain Standard Time. The dates can be found in the following table.</w:t>
+        <w:t xml:space="preserve">The dataset covers five months from May through September 2025. For each month, three clear-sky days were selected to represent the early, middle, and late portions of the month, resulting in 15 selected days. For each selected day, hourly outputs were generated from 07:00 to </w:t>
+      </w:r>
+      <w:r>
+        <w:t>19</w:t>
+      </w:r>
+      <w:r>
+        <w:t>:00 Mountain Standard Time. The dates can be found in the following table.</w:t>
       </w:r>
     </w:p>
     <w:p/>
@@ -368,6 +403,7 @@
               <w:spacing w:after="160" w:line="259" w:lineRule="auto"/>
             </w:pPr>
             <w:r>
+              <w:lastRenderedPageBreak/>
               <w:t>Month</w:t>
             </w:r>
           </w:p>

</xml_diff>